<commit_message>
humanify the conference paper
</commit_message>
<xml_diff>
--- a/week-08-proposal/Proposal.docx
+++ b/week-08-proposal/Proposal.docx
@@ -33,7 +33,7 @@
     </w:p>
     <w:p>
       <w:r>
-        <w:t>Sprint Planning is a natural point for early warning because the team can still adjust scope before execution begins. Repository data may contain useful signals, but only if the features reflect what was known at that time.</w:t>
+        <w:t>Sprint Planning matters because it's one of the last points where a team can still change course. Once execution starts, scope is mostly locked in. Repository data could help flag problems early — but only if it's handled carefully. The features have to reflect what the team actually knew at planning time, not details that only surfaced afterward.</w:t>
       </w:r>
     </w:p>
     <w:p>
@@ -46,7 +46,7 @@
     </w:p>
     <w:p>
       <w:r>
-        <w:t>The study will examine whether Jira history can rank two repository-derived outcomes: late sprint closure and unfinished scope that was committed at sprint start. The work will also test whether simple scope measures explain most of the predictable signal.</w:t>
+        <w:t>This study has two goals. First: find out whether Jira history can meaningfully rank two outcomes — sprints that close late, and committed scope that goes unfinished. Second, and simpler: check whether starting scope on its own already explains most of whatever signal is actually there.</w:t>
       </w:r>
     </w:p>
     <w:p>
@@ -62,7 +62,7 @@
         <w:pStyle w:val="ListNumber"/>
       </w:pPr>
       <w:r>
-        <w:t>How much ranking signal is present for late closure and unfinished committed scope?</w:t>
+        <w:t>How much signal is really there for late closure and unfinished committed scope?</w:t>
       </w:r>
     </w:p>
     <w:p>
@@ -70,7 +70,7 @@
         <w:pStyle w:val="ListNumber"/>
       </w:pPr>
       <w:r>
-        <w:t>Does a transparent scope-only model perform as well as more flexible models?</w:t>
+        <w:t>Does a simple scope-only model hold up against more flexible ones?</w:t>
       </w:r>
     </w:p>
     <w:p>
@@ -78,7 +78,7 @@
         <w:pStyle w:val="ListNumber"/>
       </w:pPr>
       <w:r>
-        <w:t>How stable are the results across time and across projects?</w:t>
+        <w:t>Are the results stable over time, and across different projects?</w:t>
       </w:r>
     </w:p>
     <w:p>
@@ -86,7 +86,7 @@
         <w:pStyle w:val="ListNumber"/>
       </w:pPr>
       <w:r>
-        <w:t>How sensitive are the findings to missing historical provenance and leakage-prone evaluation choices?</w:t>
+        <w:t>How much do gaps in historical provenance, or leakage-prone evaluation choices, change the findings?</w:t>
       </w:r>
     </w:p>
     <w:p>
@@ -99,7 +99,7 @@
     </w:p>
     <w:p>
       <w:r>
-        <w:t>The planned dataset is TAWOS, a relational collection of public Jira projects. The working subset contains eight projects. Sprint, Issue, and Change_Log records are used so that selected fields can be reconstructed at the start of each sprint.</w:t>
+        <w:t>TAWOS is the dataset — a relational collection of public Jira projects. Eight of those projects make up the working subset here. Three tables do the heavy lifting: Sprint, Issue, and Change_Log. Together, they let key fields get rebuilt back to the exact moment each sprint started.</w:t>
       </w:r>
     </w:p>
     <w:p>
@@ -112,7 +112,7 @@
     </w:p>
     <w:p>
       <w:r>
-        <w:t>Sprint membership and Story Points will be reconstructed from timestamped change history. Nonclosed sprints will be removed before labels are built. Models will include logistic regression, random forest, and XGBoost, alongside prevalence and scope-only baselines. Evaluation will use forward temporal splits and held-out-project transfer.</w:t>
+        <w:t>Sprint membership and Story Points won't be taken at face value from a final export — they'll be rebuilt from timestamped change history instead. Sprints that never closed get dropped first, before any labels exist. Four approaches go head to head: logistic regression, random forest, XGBoost, plus simple prevalence and scope-only baselines. For evaluation, the plan is forward-in-time splits alongside held-out-project transfer, to see whether the results actually generalize.</w:t>
       </w:r>
     </w:p>
     <w:p>
@@ -125,7 +125,7 @@
     </w:p>
     <w:p>
       <w:r>
-        <w:t>ROC-AUC will be the main ranking measure. F1, precision, recall, PR-AUC, and Brier score will be reported with their limitations. Project-level uncertainty, multiple temporal cut points, provenance sensitivity, feature permutation, and leakage demonstrations will be used to test the robustness of the main conclusions.</w:t>
+        <w:t>ROC-AUC is the primary measure here. F1, precision, recall, PR-AUC, and Brier score come along too, each with its limitations flagged rather than hidden. To really pressure-test the conclusions, the study also digs into project-level uncertainty, multiple temporal cut points, sensitivity to provenance quality, feature permutation importance, and a handful of deliberate leakage demonstrations.</w:t>
       </w:r>
     </w:p>
     <w:p>
@@ -138,7 +138,7 @@
     </w:p>
     <w:p>
       <w:r>
-        <w:t>The intended contribution is methodological as well as predictive: a reproducible example of how timing, scope provenance, prevalence, project heterogeneity, and leakage affect sprint-analytics results.</w:t>
+        <w:t>The contribution here is as much about method as it is about prediction. It's meant to work as a reproducible case study — one that shows how timing, scope provenance, class prevalence, project differences, and leakage each quietly shape what sprint-analytics results actually mean.</w:t>
       </w:r>
     </w:p>
     <w:p>
@@ -151,7 +151,7 @@
     </w:p>
     <w:p>
       <w:r>
-        <w:t>The study is retrospective and uses open-source repositories. It will not claim that a risk score improves Scrum decisions; that would require prospective validation with real teams.</w:t>
+        <w:t>This study is retrospective, and it leans entirely on open-source repositories. It won't claim that a risk score actually improves Scrum decisions — that's a bigger claim, and one that would need real teams and prospective validation to back it up.</w:t>
       </w:r>
     </w:p>
     <w:sectPr>

</xml_diff>